<commit_message>
feat: complete DP-CTGAN integration, UI modernization, and PU-Score implementation
</commit_message>
<xml_diff>
--- a/data/reports/technical_audit_report.docx
+++ b/data/reports/technical_audit_report.docx
@@ -42,7 +42,7 @@
               <w:rPr>
                 <w:b/>
               </w:rPr>
-              <w:t>Project</w:t>
+              <w:t>Tool</w:t>
             </w:r>
           </w:p>
         </w:tc>
@@ -52,82 +52,7 @@
           </w:tcPr>
           <w:p>
             <w:r>
-              <w:t>Synthetic Data Generation &amp; Evaluation using CTGAN</w:t>
-            </w:r>
-          </w:p>
-        </w:tc>
-      </w:tr>
-      <w:tr>
-        <w:tc>
-          <w:tcPr>
-            <w:tcW w:type="dxa" w:w="4320"/>
-          </w:tcPr>
-          <w:p>
-            <w:r>
-              <w:rPr>
-                <w:b/>
-              </w:rPr>
-              <w:t>Student</w:t>
-            </w:r>
-          </w:p>
-        </w:tc>
-        <w:tc>
-          <w:tcPr>
-            <w:tcW w:type="dxa" w:w="4320"/>
-          </w:tcPr>
-          <w:p>
-            <w:r>
-              <w:t>Prajval T Rathod (1MS24MC074)</w:t>
-            </w:r>
-          </w:p>
-        </w:tc>
-      </w:tr>
-      <w:tr>
-        <w:tc>
-          <w:tcPr>
-            <w:tcW w:type="dxa" w:w="4320"/>
-          </w:tcPr>
-          <w:p>
-            <w:r>
-              <w:rPr>
-                <w:b/>
-              </w:rPr>
-              <w:t>Institution</w:t>
-            </w:r>
-          </w:p>
-        </w:tc>
-        <w:tc>
-          <w:tcPr>
-            <w:tcW w:type="dxa" w:w="4320"/>
-          </w:tcPr>
-          <w:p>
-            <w:r>
-              <w:t>M.S. Ramaiah Institute of Technology — Department of MCA</w:t>
-            </w:r>
-          </w:p>
-        </w:tc>
-      </w:tr>
-      <w:tr>
-        <w:tc>
-          <w:tcPr>
-            <w:tcW w:type="dxa" w:w="4320"/>
-          </w:tcPr>
-          <w:p>
-            <w:r>
-              <w:rPr>
-                <w:b/>
-              </w:rPr>
-              <w:t>Academic Year</w:t>
-            </w:r>
-          </w:p>
-        </w:tc>
-        <w:tc>
-          <w:tcPr>
-            <w:tcW w:type="dxa" w:w="4320"/>
-          </w:tcPr>
-          <w:p>
-            <w:r>
-              <w:t>2025-26</w:t>
+              <w:t>CTGAN Studio — Synthetic Data Generator</w:t>
             </w:r>
           </w:p>
         </w:tc>
@@ -152,7 +77,7 @@
           </w:tcPr>
           <w:p>
             <w:r>
-              <w:t>March 16, 2026 — 21:29</w:t>
+              <w:t>April 25, 2026 — 12:27</w:t>
             </w:r>
           </w:p>
         </w:tc>
@@ -177,7 +102,7 @@
           </w:tcPr>
           <w:p>
             <w:r>
-              <w:t>iris.csv</w:t>
+              <w:t>CC_Expenses_Exercise.csv</w:t>
             </w:r>
           </w:p>
         </w:tc>
@@ -227,7 +152,7 @@
           </w:tcPr>
           <w:p>
             <w:r>
-              <w:t>100</w:t>
+              <w:t>1000</w:t>
             </w:r>
           </w:p>
         </w:tc>
@@ -331,7 +256,7 @@
           </w:tcPr>
           <w:p>
             <w:r>
-              <w:t>2.1878</w:t>
+              <w:t>947077.6331</w:t>
             </w:r>
           </w:p>
         </w:tc>
@@ -356,7 +281,7 @@
           </w:tcPr>
           <w:p>
             <w:r>
-              <w:t>2.254</w:t>
+              <w:t>944356.1081</w:t>
             </w:r>
           </w:p>
         </w:tc>
@@ -381,7 +306,7 @@
           </w:tcPr>
           <w:p>
             <w:r>
-              <w:t>0.7061</w:t>
+              <w:t>107.119</w:t>
             </w:r>
           </w:p>
         </w:tc>
@@ -406,7 +331,7 @@
           </w:tcPr>
           <w:p>
             <w:r>
-              <w:t>0 / 100 (0.0%)</w:t>
+              <w:t>0 / 1000 (0.0%)</w:t>
             </w:r>
           </w:p>
         </w:tc>
@@ -505,7 +430,7 @@
               <w:rPr>
                 <w:b/>
               </w:rPr>
-              <w:t>sepal_length</w:t>
+              <w:t>SL No.</w:t>
             </w:r>
           </w:p>
         </w:tc>
@@ -515,7 +440,7 @@
           </w:tcPr>
           <w:p>
             <w:r>
-              <w:t>5.8433</w:t>
+              <w:t>15.5000</w:t>
             </w:r>
           </w:p>
         </w:tc>
@@ -525,7 +450,7 @@
           </w:tcPr>
           <w:p>
             <w:r>
-              <w:t>4.7370</w:t>
+              <w:t>8197405.0000</w:t>
             </w:r>
           </w:p>
         </w:tc>
@@ -535,7 +460,7 @@
           </w:tcPr>
           <w:p>
             <w:r>
-              <w:t>1.1063</w:t>
+              <w:t>8197389.5000</w:t>
             </w:r>
           </w:p>
         </w:tc>
@@ -550,7 +475,7 @@
               <w:rPr>
                 <w:b/>
               </w:rPr>
-              <w:t>sepal_width</w:t>
+              <w:t>Sex</w:t>
             </w:r>
           </w:p>
         </w:tc>
@@ -560,7 +485,7 @@
           </w:tcPr>
           <w:p>
             <w:r>
-              <w:t>3.0540</w:t>
+              <w:t>1.5000</w:t>
             </w:r>
           </w:p>
         </w:tc>
@@ -570,7 +495,7 @@
           </w:tcPr>
           <w:p>
             <w:r>
-              <w:t>3.5280</w:t>
+              <w:t>1.4660</w:t>
             </w:r>
           </w:p>
         </w:tc>
@@ -580,7 +505,7 @@
           </w:tcPr>
           <w:p>
             <w:r>
-              <w:t>0.4740</w:t>
+              <w:t>0.0340</w:t>
             </w:r>
           </w:p>
         </w:tc>
@@ -595,7 +520,7 @@
               <w:rPr>
                 <w:b/>
               </w:rPr>
-              <w:t>petal_length</w:t>
+              <w:t>Shopping</w:t>
             </w:r>
           </w:p>
         </w:tc>
@@ -605,7 +530,7 @@
           </w:tcPr>
           <w:p>
             <w:r>
-              <w:t>3.7587</w:t>
+              <w:t>1.4333</w:t>
             </w:r>
           </w:p>
         </w:tc>
@@ -615,7 +540,7 @@
           </w:tcPr>
           <w:p>
             <w:r>
-              <w:t>3.9050</w:t>
+              <w:t>1.4330</w:t>
             </w:r>
           </w:p>
         </w:tc>
@@ -625,7 +550,7 @@
           </w:tcPr>
           <w:p>
             <w:r>
-              <w:t>0.1463</w:t>
+              <w:t>0.0003</w:t>
             </w:r>
           </w:p>
         </w:tc>
@@ -640,7 +565,7 @@
               <w:rPr>
                 <w:b/>
               </w:rPr>
-              <w:t>petal_width</w:t>
+              <w:t>Banking</w:t>
             </w:r>
           </w:p>
         </w:tc>
@@ -650,7 +575,7 @@
           </w:tcPr>
           <w:p>
             <w:r>
-              <w:t>1.1987</w:t>
+              <w:t>1.7000</w:t>
             </w:r>
           </w:p>
         </w:tc>
@@ -660,7 +585,7 @@
           </w:tcPr>
           <w:p>
             <w:r>
-              <w:t>1.7200</w:t>
+              <w:t>1.6490</w:t>
             </w:r>
           </w:p>
         </w:tc>
@@ -670,7 +595,7 @@
           </w:tcPr>
           <w:p>
             <w:r>
-              <w:t>0.5213</w:t>
+              <w:t>0.0510</w:t>
             </w:r>
           </w:p>
         </w:tc>
@@ -685,7 +610,7 @@
               <w:rPr>
                 <w:b/>
               </w:rPr>
-              <w:t>species</w:t>
+              <w:t>Credit_Card_usage</w:t>
             </w:r>
           </w:p>
         </w:tc>
@@ -695,7 +620,7 @@
           </w:tcPr>
           <w:p>
             <w:r>
-              <w:t>1.0000</w:t>
+              <w:t>66.0000</w:t>
             </w:r>
           </w:p>
         </w:tc>
@@ -705,7 +630,7 @@
           </w:tcPr>
           <w:p>
             <w:r>
-              <w:t>1.1300</w:t>
+              <w:t>76.7380</w:t>
             </w:r>
           </w:p>
         </w:tc>
@@ -715,7 +640,7 @@
           </w:tcPr>
           <w:p>
             <w:r>
-              <w:t>0.1300</w:t>
+              <w:t>10.7380</w:t>
             </w:r>
           </w:p>
         </w:tc>
@@ -801,7 +726,7 @@
               <w:rPr>
                 <w:b/>
               </w:rPr>
-              <w:t>sepal_length</w:t>
+              <w:t>SL No.</w:t>
             </w:r>
           </w:p>
         </w:tc>
@@ -811,7 +736,7 @@
           </w:tcPr>
           <w:p>
             <w:r>
-              <w:t>0.8281</w:t>
+              <w:t>8.8034</w:t>
             </w:r>
           </w:p>
         </w:tc>
@@ -821,7 +746,7 @@
           </w:tcPr>
           <w:p>
             <w:r>
-              <w:t>0.6405</w:t>
+              <w:t>4783062.5662</w:t>
             </w:r>
           </w:p>
         </w:tc>
@@ -831,7 +756,7 @@
           </w:tcPr>
           <w:p>
             <w:r>
-              <w:t>0.1876</w:t>
+              <w:t>4783053.7628</w:t>
             </w:r>
           </w:p>
         </w:tc>
@@ -846,7 +771,7 @@
               <w:rPr>
                 <w:b/>
               </w:rPr>
-              <w:t>sepal_width</w:t>
+              <w:t>Sex</w:t>
             </w:r>
           </w:p>
         </w:tc>
@@ -856,7 +781,7 @@
           </w:tcPr>
           <w:p>
             <w:r>
-              <w:t>0.4336</w:t>
+              <w:t>0.5085</w:t>
             </w:r>
           </w:p>
         </w:tc>
@@ -866,7 +791,7 @@
           </w:tcPr>
           <w:p>
             <w:r>
-              <w:t>0.5259</w:t>
+              <w:t>0.4991</w:t>
             </w:r>
           </w:p>
         </w:tc>
@@ -876,7 +801,7 @@
           </w:tcPr>
           <w:p>
             <w:r>
-              <w:t>0.0923</w:t>
+              <w:t>0.0095</w:t>
             </w:r>
           </w:p>
         </w:tc>
@@ -891,7 +816,7 @@
               <w:rPr>
                 <w:b/>
               </w:rPr>
-              <w:t>petal_length</w:t>
+              <w:t>Shopping</w:t>
             </w:r>
           </w:p>
         </w:tc>
@@ -901,7 +826,7 @@
           </w:tcPr>
           <w:p>
             <w:r>
-              <w:t>1.7644</w:t>
+              <w:t>0.5040</w:t>
             </w:r>
           </w:p>
         </w:tc>
@@ -911,7 +836,7 @@
           </w:tcPr>
           <w:p>
             <w:r>
-              <w:t>1.5878</w:t>
+              <w:t>0.4957</w:t>
             </w:r>
           </w:p>
         </w:tc>
@@ -921,7 +846,7 @@
           </w:tcPr>
           <w:p>
             <w:r>
-              <w:t>0.1766</w:t>
+              <w:t>0.0083</w:t>
             </w:r>
           </w:p>
         </w:tc>
@@ -936,7 +861,7 @@
               <w:rPr>
                 <w:b/>
               </w:rPr>
-              <w:t>petal_width</w:t>
+              <w:t>Banking</w:t>
             </w:r>
           </w:p>
         </w:tc>
@@ -946,7 +871,7 @@
           </w:tcPr>
           <w:p>
             <w:r>
-              <w:t>0.7632</w:t>
+              <w:t>0.4661</w:t>
             </w:r>
           </w:p>
         </w:tc>
@@ -956,7 +881,7 @@
           </w:tcPr>
           <w:p>
             <w:r>
-              <w:t>0.8068</w:t>
+              <w:t>0.4775</w:t>
             </w:r>
           </w:p>
         </w:tc>
@@ -966,7 +891,7 @@
           </w:tcPr>
           <w:p>
             <w:r>
-              <w:t>0.0436</w:t>
+              <w:t>0.0114</w:t>
             </w:r>
           </w:p>
         </w:tc>
@@ -981,7 +906,7 @@
               <w:rPr>
                 <w:b/>
               </w:rPr>
-              <w:t>species</w:t>
+              <w:t>Credit_Card_usage</w:t>
             </w:r>
           </w:p>
         </w:tc>
@@ -991,7 +916,7 @@
           </w:tcPr>
           <w:p>
             <w:r>
-              <w:t>0.8192</w:t>
+              <w:t>42.9595</w:t>
             </w:r>
           </w:p>
         </w:tc>
@@ -1001,7 +926,7 @@
           </w:tcPr>
           <w:p>
             <w:r>
-              <w:t>0.8487</w:t>
+              <w:t>45.1388</w:t>
             </w:r>
           </w:p>
         </w:tc>
@@ -1011,7 +936,7 @@
           </w:tcPr>
           <w:p>
             <w:r>
-              <w:t>0.0295</w:t>
+              <w:t>2.1794</w:t>
             </w:r>
           </w:p>
         </w:tc>
@@ -1046,16 +971,17 @@
         <w:tblLook w:firstColumn="1" w:firstRow="1" w:lastColumn="0" w:lastRow="0" w:noHBand="0" w:noVBand="1" w:val="04A0"/>
       </w:tblPr>
       <w:tblGrid>
-        <w:gridCol w:w="1728"/>
-        <w:gridCol w:w="1728"/>
-        <w:gridCol w:w="1728"/>
-        <w:gridCol w:w="1728"/>
-        <w:gridCol w:w="1728"/>
+        <w:gridCol w:w="1440"/>
+        <w:gridCol w:w="1440"/>
+        <w:gridCol w:w="1440"/>
+        <w:gridCol w:w="1440"/>
+        <w:gridCol w:w="1440"/>
+        <w:gridCol w:w="1440"/>
       </w:tblGrid>
       <w:tr>
         <w:tc>
           <w:tcPr>
-            <w:tcW w:type="dxa" w:w="1728"/>
+            <w:tcW w:type="dxa" w:w="1440"/>
           </w:tcPr>
           <w:p>
             <w:r>
@@ -1068,7 +994,7 @@
         </w:tc>
         <w:tc>
           <w:tcPr>
-            <w:tcW w:type="dxa" w:w="1728"/>
+            <w:tcW w:type="dxa" w:w="1440"/>
           </w:tcPr>
           <w:p>
             <w:r>
@@ -1081,7 +1007,7 @@
         </w:tc>
         <w:tc>
           <w:tcPr>
-            <w:tcW w:type="dxa" w:w="1728"/>
+            <w:tcW w:type="dxa" w:w="1440"/>
           </w:tcPr>
           <w:p>
             <w:r>
@@ -1094,7 +1020,7 @@
         </w:tc>
         <w:tc>
           <w:tcPr>
-            <w:tcW w:type="dxa" w:w="1728"/>
+            <w:tcW w:type="dxa" w:w="1440"/>
           </w:tcPr>
           <w:p>
             <w:r>
@@ -1107,7 +1033,7 @@
         </w:tc>
         <w:tc>
           <w:tcPr>
-            <w:tcW w:type="dxa" w:w="1728"/>
+            <w:tcW w:type="dxa" w:w="1440"/>
           </w:tcPr>
           <w:p>
             <w:r>
@@ -1118,11 +1044,24 @@
             </w:r>
           </w:p>
         </w:tc>
+        <w:tc>
+          <w:tcPr>
+            <w:tcW w:type="dxa" w:w="1440"/>
+          </w:tcPr>
+          <w:p>
+            <w:r>
+              <w:rPr>
+                <w:b/>
+              </w:rPr>
+              <w:t>ROC-AUC</w:t>
+            </w:r>
+          </w:p>
+        </w:tc>
       </w:tr>
       <w:tr>
         <w:tc>
           <w:tcPr>
-            <w:tcW w:type="dxa" w:w="1728"/>
+            <w:tcW w:type="dxa" w:w="1440"/>
           </w:tcPr>
           <w:p>
             <w:r>
@@ -1132,41 +1071,51 @@
         </w:tc>
         <w:tc>
           <w:tcPr>
-            <w:tcW w:type="dxa" w:w="1728"/>
+            <w:tcW w:type="dxa" w:w="1440"/>
           </w:tcPr>
           <w:p>
             <w:r>
-              <w:t>1.0</w:t>
+              <w:t>0.0</w:t>
             </w:r>
           </w:p>
         </w:tc>
         <w:tc>
           <w:tcPr>
-            <w:tcW w:type="dxa" w:w="1728"/>
+            <w:tcW w:type="dxa" w:w="1440"/>
           </w:tcPr>
           <w:p>
             <w:r>
-              <w:t>1.0</w:t>
+              <w:t>0.0</w:t>
             </w:r>
           </w:p>
         </w:tc>
         <w:tc>
           <w:tcPr>
-            <w:tcW w:type="dxa" w:w="1728"/>
+            <w:tcW w:type="dxa" w:w="1440"/>
           </w:tcPr>
           <w:p>
             <w:r>
-              <w:t>1.0</w:t>
+              <w:t>0.0</w:t>
             </w:r>
           </w:p>
         </w:tc>
         <w:tc>
           <w:tcPr>
-            <w:tcW w:type="dxa" w:w="1728"/>
+            <w:tcW w:type="dxa" w:w="1440"/>
           </w:tcPr>
           <w:p>
             <w:r>
-              <w:t>1.0</w:t>
+              <w:t>0.0</w:t>
+            </w:r>
+          </w:p>
+        </w:tc>
+        <w:tc>
+          <w:tcPr>
+            <w:tcW w:type="dxa" w:w="1440"/>
+          </w:tcPr>
+          <w:p>
+            <w:r>
+              <w:t>None</w:t>
             </w:r>
           </w:p>
         </w:tc>
@@ -1174,7 +1123,7 @@
       <w:tr>
         <w:tc>
           <w:tcPr>
-            <w:tcW w:type="dxa" w:w="1728"/>
+            <w:tcW w:type="dxa" w:w="1440"/>
           </w:tcPr>
           <w:p>
             <w:r>
@@ -1184,41 +1133,51 @@
         </w:tc>
         <w:tc>
           <w:tcPr>
-            <w:tcW w:type="dxa" w:w="1728"/>
+            <w:tcW w:type="dxa" w:w="1440"/>
           </w:tcPr>
           <w:p>
             <w:r>
-              <w:t>1.0</w:t>
+              <w:t>0.2222</w:t>
             </w:r>
           </w:p>
         </w:tc>
         <w:tc>
           <w:tcPr>
-            <w:tcW w:type="dxa" w:w="1728"/>
+            <w:tcW w:type="dxa" w:w="1440"/>
           </w:tcPr>
           <w:p>
             <w:r>
-              <w:t>1.0</w:t>
+              <w:t>0.3333</w:t>
             </w:r>
           </w:p>
         </w:tc>
         <w:tc>
           <w:tcPr>
-            <w:tcW w:type="dxa" w:w="1728"/>
+            <w:tcW w:type="dxa" w:w="1440"/>
           </w:tcPr>
           <w:p>
             <w:r>
-              <w:t>1.0</w:t>
+              <w:t>0.2222</w:t>
             </w:r>
           </w:p>
         </w:tc>
         <w:tc>
           <w:tcPr>
-            <w:tcW w:type="dxa" w:w="1728"/>
+            <w:tcW w:type="dxa" w:w="1440"/>
           </w:tcPr>
           <w:p>
             <w:r>
-              <w:t>1.0</w:t>
+              <w:t>0.2593</w:t>
+            </w:r>
+          </w:p>
+        </w:tc>
+        <w:tc>
+          <w:tcPr>
+            <w:tcW w:type="dxa" w:w="1440"/>
+          </w:tcPr>
+          <w:p>
+            <w:r>
+              <w:t>None</w:t>
             </w:r>
           </w:p>
         </w:tc>
@@ -1226,7 +1185,7 @@
       <w:tr>
         <w:tc>
           <w:tcPr>
-            <w:tcW w:type="dxa" w:w="1728"/>
+            <w:tcW w:type="dxa" w:w="1440"/>
           </w:tcPr>
           <w:p>
             <w:r>
@@ -1236,41 +1195,51 @@
         </w:tc>
         <w:tc>
           <w:tcPr>
-            <w:tcW w:type="dxa" w:w="1728"/>
+            <w:tcW w:type="dxa" w:w="1440"/>
           </w:tcPr>
           <w:p>
             <w:r>
-              <w:t>1.0</w:t>
+              <w:t>0.3333</w:t>
             </w:r>
           </w:p>
         </w:tc>
         <w:tc>
           <w:tcPr>
-            <w:tcW w:type="dxa" w:w="1728"/>
+            <w:tcW w:type="dxa" w:w="1440"/>
           </w:tcPr>
           <w:p>
             <w:r>
-              <w:t>1.0</w:t>
+              <w:t>0.3333</w:t>
             </w:r>
           </w:p>
         </w:tc>
         <w:tc>
           <w:tcPr>
-            <w:tcW w:type="dxa" w:w="1728"/>
+            <w:tcW w:type="dxa" w:w="1440"/>
           </w:tcPr>
           <w:p>
             <w:r>
-              <w:t>1.0</w:t>
+              <w:t>0.3333</w:t>
             </w:r>
           </w:p>
         </w:tc>
         <w:tc>
           <w:tcPr>
-            <w:tcW w:type="dxa" w:w="1728"/>
+            <w:tcW w:type="dxa" w:w="1440"/>
           </w:tcPr>
           <w:p>
             <w:r>
-              <w:t>1.0</w:t>
+              <w:t>0.3333</w:t>
+            </w:r>
+          </w:p>
+        </w:tc>
+        <w:tc>
+          <w:tcPr>
+            <w:tcW w:type="dxa" w:w="1440"/>
+          </w:tcPr>
+          <w:p>
+            <w:r>
+              <w:t>None</w:t>
             </w:r>
           </w:p>
         </w:tc>
@@ -1292,16 +1261,17 @@
         <w:tblLook w:firstColumn="1" w:firstRow="1" w:lastColumn="0" w:lastRow="0" w:noHBand="0" w:noVBand="1" w:val="04A0"/>
       </w:tblPr>
       <w:tblGrid>
-        <w:gridCol w:w="1728"/>
-        <w:gridCol w:w="1728"/>
-        <w:gridCol w:w="1728"/>
-        <w:gridCol w:w="1728"/>
-        <w:gridCol w:w="1728"/>
+        <w:gridCol w:w="1440"/>
+        <w:gridCol w:w="1440"/>
+        <w:gridCol w:w="1440"/>
+        <w:gridCol w:w="1440"/>
+        <w:gridCol w:w="1440"/>
+        <w:gridCol w:w="1440"/>
       </w:tblGrid>
       <w:tr>
         <w:tc>
           <w:tcPr>
-            <w:tcW w:type="dxa" w:w="1728"/>
+            <w:tcW w:type="dxa" w:w="1440"/>
           </w:tcPr>
           <w:p>
             <w:r>
@@ -1314,7 +1284,7 @@
         </w:tc>
         <w:tc>
           <w:tcPr>
-            <w:tcW w:type="dxa" w:w="1728"/>
+            <w:tcW w:type="dxa" w:w="1440"/>
           </w:tcPr>
           <w:p>
             <w:r>
@@ -1327,7 +1297,7 @@
         </w:tc>
         <w:tc>
           <w:tcPr>
-            <w:tcW w:type="dxa" w:w="1728"/>
+            <w:tcW w:type="dxa" w:w="1440"/>
           </w:tcPr>
           <w:p>
             <w:r>
@@ -1340,7 +1310,7 @@
         </w:tc>
         <w:tc>
           <w:tcPr>
-            <w:tcW w:type="dxa" w:w="1728"/>
+            <w:tcW w:type="dxa" w:w="1440"/>
           </w:tcPr>
           <w:p>
             <w:r>
@@ -1353,7 +1323,7 @@
         </w:tc>
         <w:tc>
           <w:tcPr>
-            <w:tcW w:type="dxa" w:w="1728"/>
+            <w:tcW w:type="dxa" w:w="1440"/>
           </w:tcPr>
           <w:p>
             <w:r>
@@ -1364,11 +1334,24 @@
             </w:r>
           </w:p>
         </w:tc>
+        <w:tc>
+          <w:tcPr>
+            <w:tcW w:type="dxa" w:w="1440"/>
+          </w:tcPr>
+          <w:p>
+            <w:r>
+              <w:rPr>
+                <w:b/>
+              </w:rPr>
+              <w:t>ROC-AUC</w:t>
+            </w:r>
+          </w:p>
+        </w:tc>
       </w:tr>
       <w:tr>
         <w:tc>
           <w:tcPr>
-            <w:tcW w:type="dxa" w:w="1728"/>
+            <w:tcW w:type="dxa" w:w="1440"/>
           </w:tcPr>
           <w:p>
             <w:r>
@@ -1378,41 +1361,51 @@
         </w:tc>
         <w:tc>
           <w:tcPr>
-            <w:tcW w:type="dxa" w:w="1728"/>
+            <w:tcW w:type="dxa" w:w="1440"/>
           </w:tcPr>
           <w:p>
             <w:r>
-              <w:t>0.2889</w:t>
+              <w:t>0.2222</w:t>
             </w:r>
           </w:p>
         </w:tc>
         <w:tc>
           <w:tcPr>
-            <w:tcW w:type="dxa" w:w="1728"/>
+            <w:tcW w:type="dxa" w:w="1440"/>
           </w:tcPr>
           <w:p>
             <w:r>
-              <w:t>0.0835</w:t>
+              <w:t>0.0494</w:t>
             </w:r>
           </w:p>
         </w:tc>
         <w:tc>
           <w:tcPr>
-            <w:tcW w:type="dxa" w:w="1728"/>
+            <w:tcW w:type="dxa" w:w="1440"/>
           </w:tcPr>
           <w:p>
             <w:r>
-              <w:t>0.2889</w:t>
+              <w:t>0.2222</w:t>
             </w:r>
           </w:p>
         </w:tc>
         <w:tc>
           <w:tcPr>
-            <w:tcW w:type="dxa" w:w="1728"/>
+            <w:tcW w:type="dxa" w:w="1440"/>
           </w:tcPr>
           <w:p>
             <w:r>
-              <w:t>0.1295</w:t>
+              <w:t>0.0808</w:t>
+            </w:r>
+          </w:p>
+        </w:tc>
+        <w:tc>
+          <w:tcPr>
+            <w:tcW w:type="dxa" w:w="1440"/>
+          </w:tcPr>
+          <w:p>
+            <w:r>
+              <w:t>None</w:t>
             </w:r>
           </w:p>
         </w:tc>
@@ -1420,7 +1413,7 @@
       <w:tr>
         <w:tc>
           <w:tcPr>
-            <w:tcW w:type="dxa" w:w="1728"/>
+            <w:tcW w:type="dxa" w:w="1440"/>
           </w:tcPr>
           <w:p>
             <w:r>
@@ -1430,41 +1423,51 @@
         </w:tc>
         <w:tc>
           <w:tcPr>
-            <w:tcW w:type="dxa" w:w="1728"/>
+            <w:tcW w:type="dxa" w:w="1440"/>
           </w:tcPr>
           <w:p>
             <w:r>
-              <w:t>0.4</w:t>
+              <w:t>0.0</w:t>
             </w:r>
           </w:p>
         </w:tc>
         <w:tc>
           <w:tcPr>
-            <w:tcW w:type="dxa" w:w="1728"/>
+            <w:tcW w:type="dxa" w:w="1440"/>
           </w:tcPr>
           <w:p>
             <w:r>
-              <w:t>0.3435</w:t>
+              <w:t>0.0</w:t>
             </w:r>
           </w:p>
         </w:tc>
         <w:tc>
           <w:tcPr>
-            <w:tcW w:type="dxa" w:w="1728"/>
+            <w:tcW w:type="dxa" w:w="1440"/>
           </w:tcPr>
           <w:p>
             <w:r>
-              <w:t>0.4</w:t>
+              <w:t>0.0</w:t>
             </w:r>
           </w:p>
         </w:tc>
         <w:tc>
           <w:tcPr>
-            <w:tcW w:type="dxa" w:w="1728"/>
+            <w:tcW w:type="dxa" w:w="1440"/>
           </w:tcPr>
           <w:p>
             <w:r>
-              <w:t>0.3277</w:t>
+              <w:t>0.0</w:t>
+            </w:r>
+          </w:p>
+        </w:tc>
+        <w:tc>
+          <w:tcPr>
+            <w:tcW w:type="dxa" w:w="1440"/>
+          </w:tcPr>
+          <w:p>
+            <w:r>
+              <w:t>None</w:t>
             </w:r>
           </w:p>
         </w:tc>
@@ -1472,7 +1475,7 @@
       <w:tr>
         <w:tc>
           <w:tcPr>
-            <w:tcW w:type="dxa" w:w="1728"/>
+            <w:tcW w:type="dxa" w:w="1440"/>
           </w:tcPr>
           <w:p>
             <w:r>
@@ -1482,41 +1485,51 @@
         </w:tc>
         <w:tc>
           <w:tcPr>
-            <w:tcW w:type="dxa" w:w="1728"/>
+            <w:tcW w:type="dxa" w:w="1440"/>
           </w:tcPr>
           <w:p>
             <w:r>
-              <w:t>0.2889</w:t>
+              <w:t>0.1111</w:t>
             </w:r>
           </w:p>
         </w:tc>
         <w:tc>
           <w:tcPr>
-            <w:tcW w:type="dxa" w:w="1728"/>
+            <w:tcW w:type="dxa" w:w="1440"/>
           </w:tcPr>
           <w:p>
             <w:r>
-              <w:t>0.2713</w:t>
+              <w:t>0.2222</w:t>
             </w:r>
           </w:p>
         </w:tc>
         <w:tc>
           <w:tcPr>
-            <w:tcW w:type="dxa" w:w="1728"/>
+            <w:tcW w:type="dxa" w:w="1440"/>
           </w:tcPr>
           <w:p>
             <w:r>
-              <w:t>0.2889</w:t>
+              <w:t>0.1111</w:t>
             </w:r>
           </w:p>
         </w:tc>
         <w:tc>
           <w:tcPr>
-            <w:tcW w:type="dxa" w:w="1728"/>
+            <w:tcW w:type="dxa" w:w="1440"/>
           </w:tcPr>
           <w:p>
             <w:r>
-              <w:t>0.2663</w:t>
+              <w:t>0.1481</w:t>
+            </w:r>
+          </w:p>
+        </w:tc>
+        <w:tc>
+          <w:tcPr>
+            <w:tcW w:type="dxa" w:w="1440"/>
+          </w:tcPr>
+          <w:p>
+            <w:r>
+              <w:t>None</w:t>
             </w:r>
           </w:p>
         </w:tc>
@@ -1609,7 +1622,7 @@
           </w:tcPr>
           <w:p>
             <w:r>
-              <w:t>sepal_length</w:t>
+              <w:t>SL No.</w:t>
             </w:r>
           </w:p>
         </w:tc>
@@ -1619,7 +1632,7 @@
           </w:tcPr>
           <w:p>
             <w:r>
-              <w:t>0.1041</w:t>
+              <w:t>0.6007</w:t>
             </w:r>
           </w:p>
         </w:tc>
@@ -1629,7 +1642,7 @@
           </w:tcPr>
           <w:p>
             <w:r>
-              <w:t>0.174</w:t>
+              <w:t>0.9502</w:t>
             </w:r>
           </w:p>
         </w:tc>
@@ -1639,7 +1652,7 @@
           </w:tcPr>
           <w:p>
             <w:r>
-              <w:t>0.0699</w:t>
+              <w:t>0.3495</w:t>
             </w:r>
           </w:p>
         </w:tc>
@@ -1651,7 +1664,7 @@
           </w:tcPr>
           <w:p>
             <w:r>
-              <w:t>sepal_width</w:t>
+              <w:t>Sex</w:t>
             </w:r>
           </w:p>
         </w:tc>
@@ -1661,7 +1674,7 @@
           </w:tcPr>
           <w:p>
             <w:r>
-              <w:t>0.0446</w:t>
+              <w:t>0.1539</w:t>
             </w:r>
           </w:p>
         </w:tc>
@@ -1671,7 +1684,7 @@
           </w:tcPr>
           <w:p>
             <w:r>
-              <w:t>0.2744</w:t>
+              <w:t>0.0145</w:t>
             </w:r>
           </w:p>
         </w:tc>
@@ -1681,7 +1694,7 @@
           </w:tcPr>
           <w:p>
             <w:r>
-              <w:t>0.2298</w:t>
+              <w:t>0.1394</w:t>
             </w:r>
           </w:p>
         </w:tc>
@@ -1693,7 +1706,7 @@
           </w:tcPr>
           <w:p>
             <w:r>
-              <w:t>petal_length</w:t>
+              <w:t>Shopping</w:t>
             </w:r>
           </w:p>
         </w:tc>
@@ -1703,7 +1716,7 @@
           </w:tcPr>
           <w:p>
             <w:r>
-              <w:t>0.4173</w:t>
+              <w:t>0.1268</w:t>
             </w:r>
           </w:p>
         </w:tc>
@@ -1713,7 +1726,7 @@
           </w:tcPr>
           <w:p>
             <w:r>
-              <w:t>0.326</w:t>
+              <w:t>0.0172</w:t>
             </w:r>
           </w:p>
         </w:tc>
@@ -1723,7 +1736,7 @@
           </w:tcPr>
           <w:p>
             <w:r>
-              <w:t>0.0913</w:t>
+              <w:t>0.1096</w:t>
             </w:r>
           </w:p>
         </w:tc>
@@ -1735,7 +1748,7 @@
           </w:tcPr>
           <w:p>
             <w:r>
-              <w:t>petal_width</w:t>
+              <w:t>Banking</w:t>
             </w:r>
           </w:p>
         </w:tc>
@@ -1745,7 +1758,7 @@
           </w:tcPr>
           <w:p>
             <w:r>
-              <w:t>0.434</w:t>
+              <w:t>0.1186</w:t>
             </w:r>
           </w:p>
         </w:tc>
@@ -1755,7 +1768,7 @@
           </w:tcPr>
           <w:p>
             <w:r>
-              <w:t>0.2255</w:t>
+              <w:t>0.0182</w:t>
             </w:r>
           </w:p>
         </w:tc>
@@ -1765,7 +1778,7 @@
           </w:tcPr>
           <w:p>
             <w:r>
-              <w:t>0.2085</w:t>
+              <w:t>0.1004</w:t>
             </w:r>
           </w:p>
         </w:tc>
@@ -1777,7 +1790,613 @@
         <w:pStyle w:val="Heading1"/>
       </w:pPr>
       <w:r>
-        <w:t>4. Distribution &amp; Correlation Plots</w:t>
+        <w:t>4. Scientific Quality Scores</w:t>
+      </w:r>
+    </w:p>
+    <w:p>
+      <w:r>
+        <w:t>Formal statistical tests quantify how closely the synthetic distributions match the original data.</w:t>
+      </w:r>
+    </w:p>
+    <w:tbl>
+      <w:tblPr>
+        <w:tblStyle w:val="LightGrid-Accent1"/>
+        <w:tblW w:type="auto" w:w="0"/>
+        <w:tblLook w:firstColumn="1" w:firstRow="1" w:lastColumn="0" w:lastRow="0" w:noHBand="0" w:noVBand="1" w:val="04A0"/>
+      </w:tblPr>
+      <w:tblGrid>
+        <w:gridCol w:w="4320"/>
+        <w:gridCol w:w="4320"/>
+      </w:tblGrid>
+      <w:tr>
+        <w:tc>
+          <w:tcPr>
+            <w:tcW w:type="dxa" w:w="4320"/>
+          </w:tcPr>
+          <w:p>
+            <w:r>
+              <w:rPr>
+                <w:b/>
+              </w:rPr>
+              <w:t>KS Similarity (1.0 = identical)</w:t>
+            </w:r>
+          </w:p>
+        </w:tc>
+        <w:tc>
+          <w:tcPr>
+            <w:tcW w:type="dxa" w:w="4320"/>
+          </w:tcPr>
+          <w:p>
+            <w:r>
+              <w:t>0.7352</w:t>
+            </w:r>
+          </w:p>
+        </w:tc>
+      </w:tr>
+      <w:tr>
+        <w:tc>
+          <w:tcPr>
+            <w:tcW w:type="dxa" w:w="4320"/>
+          </w:tcPr>
+          <w:p>
+            <w:r>
+              <w:rPr>
+                <w:b/>
+              </w:rPr>
+              <w:t>JS Similarity (1.0 = zero divergence)</w:t>
+            </w:r>
+          </w:p>
+        </w:tc>
+        <w:tc>
+          <w:tcPr>
+            <w:tcW w:type="dxa" w:w="4320"/>
+          </w:tcPr>
+          <w:p>
+            <w:r>
+              <w:t>0.7067</w:t>
+            </w:r>
+          </w:p>
+        </w:tc>
+      </w:tr>
+      <w:tr>
+        <w:tc>
+          <w:tcPr>
+            <w:tcW w:type="dxa" w:w="4320"/>
+          </w:tcPr>
+          <w:p>
+            <w:r>
+              <w:rPr>
+                <w:b/>
+              </w:rPr>
+              <w:t>Correlation Similarity</w:t>
+            </w:r>
+          </w:p>
+        </w:tc>
+        <w:tc>
+          <w:tcPr>
+            <w:tcW w:type="dxa" w:w="4320"/>
+          </w:tcPr>
+          <w:p>
+            <w:r>
+              <w:t>75.52%</w:t>
+            </w:r>
+          </w:p>
+        </w:tc>
+      </w:tr>
+    </w:tbl>
+    <w:p>
+      <w:pPr>
+        <w:pStyle w:val="Heading2"/>
+      </w:pPr>
+      <w:r>
+        <w:t>Kolmogorov-Smirnov Test (per column)</w:t>
+      </w:r>
+    </w:p>
+    <w:tbl>
+      <w:tblPr>
+        <w:tblStyle w:val="LightGrid-Accent1"/>
+        <w:tblW w:type="auto" w:w="0"/>
+        <w:tblLook w:firstColumn="1" w:firstRow="1" w:lastColumn="0" w:lastRow="0" w:noHBand="0" w:noVBand="1" w:val="04A0"/>
+      </w:tblPr>
+      <w:tblGrid>
+        <w:gridCol w:w="2160"/>
+        <w:gridCol w:w="2160"/>
+        <w:gridCol w:w="2160"/>
+        <w:gridCol w:w="2160"/>
+      </w:tblGrid>
+      <w:tr>
+        <w:tc>
+          <w:tcPr>
+            <w:tcW w:type="dxa" w:w="2160"/>
+          </w:tcPr>
+          <w:p>
+            <w:r>
+              <w:rPr>
+                <w:b/>
+              </w:rPr>
+              <w:t>Column</w:t>
+            </w:r>
+          </w:p>
+        </w:tc>
+        <w:tc>
+          <w:tcPr>
+            <w:tcW w:type="dxa" w:w="2160"/>
+          </w:tcPr>
+          <w:p>
+            <w:r>
+              <w:rPr>
+                <w:b/>
+              </w:rPr>
+              <w:t>KS Statistic</w:t>
+            </w:r>
+          </w:p>
+        </w:tc>
+        <w:tc>
+          <w:tcPr>
+            <w:tcW w:type="dxa" w:w="2160"/>
+          </w:tcPr>
+          <w:p>
+            <w:r>
+              <w:rPr>
+                <w:b/>
+              </w:rPr>
+              <w:t>P-Value</w:t>
+            </w:r>
+          </w:p>
+        </w:tc>
+        <w:tc>
+          <w:tcPr>
+            <w:tcW w:type="dxa" w:w="2160"/>
+          </w:tcPr>
+          <w:p>
+            <w:r>
+              <w:rPr>
+                <w:b/>
+              </w:rPr>
+              <w:t>Result</w:t>
+            </w:r>
+          </w:p>
+        </w:tc>
+      </w:tr>
+      <w:tr>
+        <w:tc>
+          <w:tcPr>
+            <w:tcW w:type="dxa" w:w="2160"/>
+          </w:tcPr>
+          <w:p>
+            <w:r>
+              <w:t>SL No.</w:t>
+            </w:r>
+          </w:p>
+        </w:tc>
+        <w:tc>
+          <w:tcPr>
+            <w:tcW w:type="dxa" w:w="2160"/>
+          </w:tcPr>
+          <w:p>
+            <w:r>
+              <w:t>1.0</w:t>
+            </w:r>
+          </w:p>
+        </w:tc>
+        <w:tc>
+          <w:tcPr>
+            <w:tcW w:type="dxa" w:w="2160"/>
+          </w:tcPr>
+          <w:p>
+            <w:r>
+              <w:t>0.0</w:t>
+            </w:r>
+          </w:p>
+        </w:tc>
+        <w:tc>
+          <w:tcPr>
+            <w:tcW w:type="dxa" w:w="2160"/>
+          </w:tcPr>
+          <w:p>
+            <w:r>
+              <w:t>Fail</w:t>
+            </w:r>
+          </w:p>
+        </w:tc>
+      </w:tr>
+      <w:tr>
+        <w:tc>
+          <w:tcPr>
+            <w:tcW w:type="dxa" w:w="2160"/>
+          </w:tcPr>
+          <w:p>
+            <w:r>
+              <w:t>Sex</w:t>
+            </w:r>
+          </w:p>
+        </w:tc>
+        <w:tc>
+          <w:tcPr>
+            <w:tcW w:type="dxa" w:w="2160"/>
+          </w:tcPr>
+          <w:p>
+            <w:r>
+              <w:t>0.034</w:t>
+            </w:r>
+          </w:p>
+        </w:tc>
+        <w:tc>
+          <w:tcPr>
+            <w:tcW w:type="dxa" w:w="2160"/>
+          </w:tcPr>
+          <w:p>
+            <w:r>
+              <w:t>1.0</w:t>
+            </w:r>
+          </w:p>
+        </w:tc>
+        <w:tc>
+          <w:tcPr>
+            <w:tcW w:type="dxa" w:w="2160"/>
+          </w:tcPr>
+          <w:p>
+            <w:r>
+              <w:t>Pass</w:t>
+            </w:r>
+          </w:p>
+        </w:tc>
+      </w:tr>
+      <w:tr>
+        <w:tc>
+          <w:tcPr>
+            <w:tcW w:type="dxa" w:w="2160"/>
+          </w:tcPr>
+          <w:p>
+            <w:r>
+              <w:t>Shopping</w:t>
+            </w:r>
+          </w:p>
+        </w:tc>
+        <w:tc>
+          <w:tcPr>
+            <w:tcW w:type="dxa" w:w="2160"/>
+          </w:tcPr>
+          <w:p>
+            <w:r>
+              <w:t>0.0003</w:t>
+            </w:r>
+          </w:p>
+        </w:tc>
+        <w:tc>
+          <w:tcPr>
+            <w:tcW w:type="dxa" w:w="2160"/>
+          </w:tcPr>
+          <w:p>
+            <w:r>
+              <w:t>1.0</w:t>
+            </w:r>
+          </w:p>
+        </w:tc>
+        <w:tc>
+          <w:tcPr>
+            <w:tcW w:type="dxa" w:w="2160"/>
+          </w:tcPr>
+          <w:p>
+            <w:r>
+              <w:t>Pass</w:t>
+            </w:r>
+          </w:p>
+        </w:tc>
+      </w:tr>
+      <w:tr>
+        <w:tc>
+          <w:tcPr>
+            <w:tcW w:type="dxa" w:w="2160"/>
+          </w:tcPr>
+          <w:p>
+            <w:r>
+              <w:t>Banking</w:t>
+            </w:r>
+          </w:p>
+        </w:tc>
+        <w:tc>
+          <w:tcPr>
+            <w:tcW w:type="dxa" w:w="2160"/>
+          </w:tcPr>
+          <w:p>
+            <w:r>
+              <w:t>0.051</w:t>
+            </w:r>
+          </w:p>
+        </w:tc>
+        <w:tc>
+          <w:tcPr>
+            <w:tcW w:type="dxa" w:w="2160"/>
+          </w:tcPr>
+          <w:p>
+            <w:r>
+              <w:t>1.0</w:t>
+            </w:r>
+          </w:p>
+        </w:tc>
+        <w:tc>
+          <w:tcPr>
+            <w:tcW w:type="dxa" w:w="2160"/>
+          </w:tcPr>
+          <w:p>
+            <w:r>
+              <w:t>Pass</w:t>
+            </w:r>
+          </w:p>
+        </w:tc>
+      </w:tr>
+      <w:tr>
+        <w:tc>
+          <w:tcPr>
+            <w:tcW w:type="dxa" w:w="2160"/>
+          </w:tcPr>
+          <w:p>
+            <w:r>
+              <w:t>Credit_Card_usage</w:t>
+            </w:r>
+          </w:p>
+        </w:tc>
+        <w:tc>
+          <w:tcPr>
+            <w:tcW w:type="dxa" w:w="2160"/>
+          </w:tcPr>
+          <w:p>
+            <w:r>
+              <w:t>0.2387</w:t>
+            </w:r>
+          </w:p>
+        </w:tc>
+        <w:tc>
+          <w:tcPr>
+            <w:tcW w:type="dxa" w:w="2160"/>
+          </w:tcPr>
+          <w:p>
+            <w:r>
+              <w:t>0.0607</w:t>
+            </w:r>
+          </w:p>
+        </w:tc>
+        <w:tc>
+          <w:tcPr>
+            <w:tcW w:type="dxa" w:w="2160"/>
+          </w:tcPr>
+          <w:p>
+            <w:r>
+              <w:t>Pass</w:t>
+            </w:r>
+          </w:p>
+        </w:tc>
+      </w:tr>
+    </w:tbl>
+    <w:p>
+      <w:pPr>
+        <w:pStyle w:val="Heading2"/>
+      </w:pPr>
+      <w:r>
+        <w:t>Jensen-Shannon Distance (per column)</w:t>
+      </w:r>
+    </w:p>
+    <w:tbl>
+      <w:tblPr>
+        <w:tblStyle w:val="LightGrid-Accent1"/>
+        <w:tblW w:type="auto" w:w="0"/>
+        <w:tblLook w:firstColumn="1" w:firstRow="1" w:lastColumn="0" w:lastRow="0" w:noHBand="0" w:noVBand="1" w:val="04A0"/>
+      </w:tblPr>
+      <w:tblGrid>
+        <w:gridCol w:w="2880"/>
+        <w:gridCol w:w="2880"/>
+        <w:gridCol w:w="2880"/>
+      </w:tblGrid>
+      <w:tr>
+        <w:tc>
+          <w:tcPr>
+            <w:tcW w:type="dxa" w:w="2880"/>
+          </w:tcPr>
+          <w:p>
+            <w:r>
+              <w:rPr>
+                <w:b/>
+              </w:rPr>
+              <w:t>Column</w:t>
+            </w:r>
+          </w:p>
+        </w:tc>
+        <w:tc>
+          <w:tcPr>
+            <w:tcW w:type="dxa" w:w="2880"/>
+          </w:tcPr>
+          <w:p>
+            <w:r>
+              <w:rPr>
+                <w:b/>
+              </w:rPr>
+              <w:t>JS Distance</w:t>
+            </w:r>
+          </w:p>
+        </w:tc>
+        <w:tc>
+          <w:tcPr>
+            <w:tcW w:type="dxa" w:w="2880"/>
+          </w:tcPr>
+          <w:p>
+            <w:r>
+              <w:rPr>
+                <w:b/>
+              </w:rPr>
+              <w:t>Similarity</w:t>
+            </w:r>
+          </w:p>
+        </w:tc>
+      </w:tr>
+      <w:tr>
+        <w:tc>
+          <w:tcPr>
+            <w:tcW w:type="dxa" w:w="2880"/>
+          </w:tcPr>
+          <w:p>
+            <w:r>
+              <w:t>SL No.</w:t>
+            </w:r>
+          </w:p>
+        </w:tc>
+        <w:tc>
+          <w:tcPr>
+            <w:tcW w:type="dxa" w:w="2880"/>
+          </w:tcPr>
+          <w:p>
+            <w:r>
+              <w:t>0.809</w:t>
+            </w:r>
+          </w:p>
+        </w:tc>
+        <w:tc>
+          <w:tcPr>
+            <w:tcW w:type="dxa" w:w="2880"/>
+          </w:tcPr>
+          <w:p>
+            <w:r>
+              <w:t>0.191</w:t>
+            </w:r>
+          </w:p>
+        </w:tc>
+      </w:tr>
+      <w:tr>
+        <w:tc>
+          <w:tcPr>
+            <w:tcW w:type="dxa" w:w="2880"/>
+          </w:tcPr>
+          <w:p>
+            <w:r>
+              <w:t>Sex</w:t>
+            </w:r>
+          </w:p>
+        </w:tc>
+        <w:tc>
+          <w:tcPr>
+            <w:tcW w:type="dxa" w:w="2880"/>
+          </w:tcPr>
+          <w:p>
+            <w:r>
+              <w:t>0.0241</w:t>
+            </w:r>
+          </w:p>
+        </w:tc>
+        <w:tc>
+          <w:tcPr>
+            <w:tcW w:type="dxa" w:w="2880"/>
+          </w:tcPr>
+          <w:p>
+            <w:r>
+              <w:t>0.9759</w:t>
+            </w:r>
+          </w:p>
+        </w:tc>
+      </w:tr>
+      <w:tr>
+        <w:tc>
+          <w:tcPr>
+            <w:tcW w:type="dxa" w:w="2880"/>
+          </w:tcPr>
+          <w:p>
+            <w:r>
+              <w:t>Shopping</w:t>
+            </w:r>
+          </w:p>
+        </w:tc>
+        <w:tc>
+          <w:tcPr>
+            <w:tcW w:type="dxa" w:w="2880"/>
+          </w:tcPr>
+          <w:p>
+            <w:r>
+              <w:t>0.0002</w:t>
+            </w:r>
+          </w:p>
+        </w:tc>
+        <w:tc>
+          <w:tcPr>
+            <w:tcW w:type="dxa" w:w="2880"/>
+          </w:tcPr>
+          <w:p>
+            <w:r>
+              <w:t>0.9998</w:t>
+            </w:r>
+          </w:p>
+        </w:tc>
+      </w:tr>
+      <w:tr>
+        <w:tc>
+          <w:tcPr>
+            <w:tcW w:type="dxa" w:w="2880"/>
+          </w:tcPr>
+          <w:p>
+            <w:r>
+              <w:t>Banking</w:t>
+            </w:r>
+          </w:p>
+        </w:tc>
+        <w:tc>
+          <w:tcPr>
+            <w:tcW w:type="dxa" w:w="2880"/>
+          </w:tcPr>
+          <w:p>
+            <w:r>
+              <w:t>0.0385</w:t>
+            </w:r>
+          </w:p>
+        </w:tc>
+        <w:tc>
+          <w:tcPr>
+            <w:tcW w:type="dxa" w:w="2880"/>
+          </w:tcPr>
+          <w:p>
+            <w:r>
+              <w:t>0.9615</w:t>
+            </w:r>
+          </w:p>
+        </w:tc>
+      </w:tr>
+      <w:tr>
+        <w:tc>
+          <w:tcPr>
+            <w:tcW w:type="dxa" w:w="2880"/>
+          </w:tcPr>
+          <w:p>
+            <w:r>
+              <w:t>Credit_Card_usage</w:t>
+            </w:r>
+          </w:p>
+        </w:tc>
+        <w:tc>
+          <w:tcPr>
+            <w:tcW w:type="dxa" w:w="2880"/>
+          </w:tcPr>
+          <w:p>
+            <w:r>
+              <w:t>0.5948</w:t>
+            </w:r>
+          </w:p>
+        </w:tc>
+        <w:tc>
+          <w:tcPr>
+            <w:tcW w:type="dxa" w:w="2880"/>
+          </w:tcPr>
+          <w:p>
+            <w:r>
+              <w:t>0.4052</w:t>
+            </w:r>
+          </w:p>
+        </w:tc>
+      </w:tr>
+    </w:tbl>
+    <w:p/>
+    <w:p>
+      <w:pPr>
+        <w:pStyle w:val="Heading1"/>
+      </w:pPr>
+      <w:r>
+        <w:t>5. Distribution &amp; Correlation Plots</w:t>
       </w:r>
     </w:p>
     <w:p>
@@ -1838,7 +2457,7 @@
         <w:pStyle w:val="Heading3"/>
       </w:pPr>
       <w:r>
-        <w:t>Dist Petal Length</w:t>
+        <w:t>Dist Banking</w:t>
       </w:r>
     </w:p>
     <w:p>
@@ -1857,7 +2476,7 @@
               <a:graphicData uri="http://schemas.openxmlformats.org/drawingml/2006/picture">
                 <pic:pic>
                   <pic:nvPicPr>
-                    <pic:cNvPr id="0" name="dist_petal_length.png"/>
+                    <pic:cNvPr id="0" name="dist_Banking.png"/>
                     <pic:cNvPicPr/>
                   </pic:nvPicPr>
                   <pic:blipFill>
@@ -1886,7 +2505,7 @@
         <w:pStyle w:val="Heading3"/>
       </w:pPr>
       <w:r>
-        <w:t>Dist Petal Width</w:t>
+        <w:t>Dist Credit Card Usage</w:t>
       </w:r>
     </w:p>
     <w:p>
@@ -1905,7 +2524,7 @@
               <a:graphicData uri="http://schemas.openxmlformats.org/drawingml/2006/picture">
                 <pic:pic>
                   <pic:nvPicPr>
-                    <pic:cNvPr id="0" name="dist_petal_width.png"/>
+                    <pic:cNvPr id="0" name="dist_Credit_Card_usage.png"/>
                     <pic:cNvPicPr/>
                   </pic:nvPicPr>
                   <pic:blipFill>
@@ -1934,7 +2553,7 @@
         <w:pStyle w:val="Heading3"/>
       </w:pPr>
       <w:r>
-        <w:t>Dist Sepal Length</w:t>
+        <w:t>Dist Sl No.</w:t>
       </w:r>
     </w:p>
     <w:p>
@@ -1953,7 +2572,7 @@
               <a:graphicData uri="http://schemas.openxmlformats.org/drawingml/2006/picture">
                 <pic:pic>
                   <pic:nvPicPr>
-                    <pic:cNvPr id="0" name="dist_sepal_length.png"/>
+                    <pic:cNvPr id="0" name="dist_SL No..png"/>
                     <pic:cNvPicPr/>
                   </pic:nvPicPr>
                   <pic:blipFill>
@@ -1982,7 +2601,7 @@
         <w:pStyle w:val="Heading3"/>
       </w:pPr>
       <w:r>
-        <w:t>Dist Sepal Width</w:t>
+        <w:t>Dist Sex</w:t>
       </w:r>
     </w:p>
     <w:p>
@@ -2001,7 +2620,7 @@
               <a:graphicData uri="http://schemas.openxmlformats.org/drawingml/2006/picture">
                 <pic:pic>
                   <pic:nvPicPr>
-                    <pic:cNvPr id="0" name="dist_sepal_width.png"/>
+                    <pic:cNvPr id="0" name="dist_Sex.png"/>
                     <pic:cNvPicPr/>
                   </pic:nvPicPr>
                   <pic:blipFill>
@@ -2030,7 +2649,7 @@
         <w:pStyle w:val="Heading3"/>
       </w:pPr>
       <w:r>
-        <w:t>Dist Species</w:t>
+        <w:t>Dist Shopping</w:t>
       </w:r>
     </w:p>
     <w:p>
@@ -2049,7 +2668,7 @@
               <a:graphicData uri="http://schemas.openxmlformats.org/drawingml/2006/picture">
                 <pic:pic>
                   <pic:nvPicPr>
-                    <pic:cNvPr id="0" name="dist_species.png"/>
+                    <pic:cNvPr id="0" name="dist_Shopping.png"/>
                     <pic:cNvPicPr/>
                   </pic:nvPicPr>
                   <pic:blipFill>

</xml_diff>